<commit_message>
debugged calc_scores.qmd before 1st render for v3; simplify msens-summary_programareas.qmd
</commit_message>
<xml_diff>
--- a/figs/msens-summary_programareas_v3/table_ecoregion_programarea_scores_v3.docx
+++ b/figs/msens-summary_programareas_v3/table_ecoregion_programarea_scores_v3.docx
@@ -27,6 +27,7 @@
         <w:gridCol w:w="1080"/>
         <w:gridCol w:w="1080"/>
         <w:gridCol w:w="1080"/>
+        <w:gridCol w:w="1080"/>
       </w:tblGrid>
       <w:tr>
         <w:trPr>
@@ -542,6 +543,60 @@
                 <w:szCs w:val="20"/>
                 <w:color w:val="000000"/>
               </w:rPr>
+              <w:t xml:space="preserve">Turtle</w:t>
+            </w:r>
+          </w:p>
+        </w:tc>
+        <w:tc>
+          <w:tcPr>
+            <w:tcBorders>
+              <w:bottom w:val="single" w:sz="12" w:space="0" w:color="BEBEBE"/>
+              <w:top w:val="single" w:sz="12" w:space="0" w:color="BEBEBE"/>
+              <w:left w:val="none" w:sz="0" w:space="0" w:color="000000"/>
+              <w:right w:val="none" w:sz="0" w:space="0" w:color="000000"/>
+            </w:tcBorders>
+            <w:shd w:val="clear" w:color="auto" w:fill="FFFFFF"/>
+            <w:tcMar>
+              <w:top w:w="0" w:type="dxa"/>
+              <w:bottom w:w="0" w:type="dxa"/>
+              <w:left w:w="0" w:type="dxa"/>
+              <w:right w:w="0" w:type="dxa"/>
+            </w:tcMar>
+            <w:vAlign w:val="center"/>
+          </w:tcPr>
+          <w:p>
+            <w:pPr>
+              <w:jc w:val="right"/>
+              <w:pBdr>
+                <w:bottom w:val="none" w:sz="0" w:space="0" w:color="000000"/>
+                <w:top w:val="none" w:sz="0" w:space="0" w:color="000000"/>
+                <w:left w:val="none" w:sz="0" w:space="0" w:color="000000"/>
+                <w:right w:val="none" w:sz="0" w:space="0" w:color="000000"/>
+              </w:pBdr>
+              <w:spacing w:after="100" w:before="100" w:line="240"/>
+              <w:ind w:left="100" w:right="100" w:firstLine="0" w:firstLineChars="0"/>
+              <w:rPr>
+                <w:rFonts w:ascii="Arial" w:hAnsi="Helvetica" w:eastAsia="Helvetica" w:cs="Helvetica"/>
+                <w:i w:val="false"/>
+                <w:b w:val="true"/>
+                <w:u w:val="none"/>
+                <w:strike w:val="false"/>
+                <w:sz w:val="20"/>
+                <w:szCs w:val="20"/>
+                <w:color w:val="000000"/>
+              </w:rPr>
+            </w:pPr>
+            <w:r>
+              <w:rPr>
+                <w:rFonts w:ascii="Arial" w:hAnsi="Helvetica" w:eastAsia="Helvetica" w:cs="Helvetica"/>
+                <w:i w:val="false"/>
+                <w:b w:val="true"/>
+                <w:u w:val="none"/>
+                <w:strike w:val="false"/>
+                <w:sz w:val="20"/>
+                <w:szCs w:val="20"/>
+                <w:color w:val="000000"/>
+              </w:rPr>
               <w:t xml:space="preserve">Other</w:t>
             </w:r>
           </w:p>
@@ -1297,6 +1352,60 @@
                 <w:szCs w:val="20"/>
                 <w:color w:val="000000"/>
               </w:rPr>
+              <w:t xml:space="preserve"/>
+            </w:r>
+          </w:p>
+        </w:tc>
+        <w:tc>
+          <w:tcPr>
+            <w:tcBorders>
+              <w:bottom w:val="single" w:sz="6" w:space="0" w:color="BEBEBE"/>
+              <w:top w:val="single" w:sz="12" w:space="0" w:color="BEBEBE"/>
+              <w:left w:val="none" w:sz="0" w:space="0" w:color="000000"/>
+              <w:right w:val="none" w:sz="0" w:space="0" w:color="000000"/>
+            </w:tcBorders>
+            <w:shd w:val="clear" w:color="auto" w:fill="FFFFFF"/>
+            <w:tcMar>
+              <w:top w:w="0" w:type="dxa"/>
+              <w:bottom w:w="0" w:type="dxa"/>
+              <w:left w:w="0" w:type="dxa"/>
+              <w:right w:w="0" w:type="dxa"/>
+            </w:tcMar>
+            <w:vAlign w:val="center"/>
+          </w:tcPr>
+          <w:p>
+            <w:pPr>
+              <w:jc w:val="right"/>
+              <w:pBdr>
+                <w:bottom w:val="none" w:sz="0" w:space="0" w:color="000000"/>
+                <w:top w:val="none" w:sz="0" w:space="0" w:color="000000"/>
+                <w:left w:val="none" w:sz="0" w:space="0" w:color="000000"/>
+                <w:right w:val="none" w:sz="0" w:space="0" w:color="000000"/>
+              </w:pBdr>
+              <w:spacing w:after="100" w:before="100" w:line="240"/>
+              <w:ind w:left="100" w:right="100" w:firstLine="0" w:firstLineChars="0"/>
+              <w:rPr>
+                <w:rFonts w:ascii="Arial" w:hAnsi="Helvetica" w:eastAsia="Helvetica" w:cs="Helvetica"/>
+                <w:i w:val="false"/>
+                <w:b w:val="false"/>
+                <w:u w:val="none"/>
+                <w:strike w:val="false"/>
+                <w:sz w:val="20"/>
+                <w:szCs w:val="20"/>
+                <w:color w:val="000000"/>
+              </w:rPr>
+            </w:pPr>
+            <w:r>
+              <w:rPr>
+                <w:rFonts w:ascii="Arial" w:hAnsi="Helvetica" w:eastAsia="Helvetica" w:cs="Helvetica"/>
+                <w:i w:val="false"/>
+                <w:b w:val="false"/>
+                <w:u w:val="none"/>
+                <w:strike w:val="false"/>
+                <w:sz w:val="20"/>
+                <w:szCs w:val="20"/>
+                <w:color w:val="000000"/>
+              </w:rPr>
               <w:t xml:space="preserve">28</w:t>
             </w:r>
           </w:p>
@@ -1921,6 +2030,60 @@
                 <w:szCs w:val="20"/>
                 <w:color w:val="000000"/>
               </w:rPr>
+              <w:t xml:space="preserve"/>
+            </w:r>
+          </w:p>
+        </w:tc>
+        <w:tc>
+          <w:tcPr>
+            <w:tcBorders>
+              <w:bottom w:val="single" w:sz="6" w:space="0" w:color="BEBEBE"/>
+              <w:top w:val="single" w:sz="6" w:space="0" w:color="BEBEBE"/>
+              <w:left w:val="none" w:sz="0" w:space="0" w:color="000000"/>
+              <w:right w:val="none" w:sz="0" w:space="0" w:color="000000"/>
+            </w:tcBorders>
+            <w:shd w:val="clear" w:color="auto" w:fill="FFFFFF"/>
+            <w:tcMar>
+              <w:top w:w="0" w:type="dxa"/>
+              <w:bottom w:w="0" w:type="dxa"/>
+              <w:left w:w="0" w:type="dxa"/>
+              <w:right w:w="0" w:type="dxa"/>
+            </w:tcMar>
+            <w:vAlign w:val="center"/>
+          </w:tcPr>
+          <w:p>
+            <w:pPr>
+              <w:jc w:val="right"/>
+              <w:pBdr>
+                <w:bottom w:val="none" w:sz="0" w:space="0" w:color="000000"/>
+                <w:top w:val="none" w:sz="0" w:space="0" w:color="000000"/>
+                <w:left w:val="none" w:sz="0" w:space="0" w:color="000000"/>
+                <w:right w:val="none" w:sz="0" w:space="0" w:color="000000"/>
+              </w:pBdr>
+              <w:spacing w:after="100" w:before="100" w:line="240"/>
+              <w:ind w:left="100" w:right="100" w:firstLine="0" w:firstLineChars="0"/>
+              <w:rPr>
+                <w:rFonts w:ascii="Arial" w:hAnsi="Helvetica" w:eastAsia="Helvetica" w:cs="Helvetica"/>
+                <w:i w:val="false"/>
+                <w:b w:val="false"/>
+                <w:u w:val="none"/>
+                <w:strike w:val="false"/>
+                <w:sz w:val="20"/>
+                <w:szCs w:val="20"/>
+                <w:color w:val="000000"/>
+              </w:rPr>
+            </w:pPr>
+            <w:r>
+              <w:rPr>
+                <w:rFonts w:ascii="Arial" w:hAnsi="Helvetica" w:eastAsia="Helvetica" w:cs="Helvetica"/>
+                <w:i w:val="false"/>
+                <w:b w:val="false"/>
+                <w:u w:val="none"/>
+                <w:strike w:val="false"/>
+                <w:sz w:val="20"/>
+                <w:szCs w:val="20"/>
+                <w:color w:val="000000"/>
+              </w:rPr>
               <w:t xml:space="preserve">21</w:t>
             </w:r>
           </w:p>
@@ -2545,6 +2708,60 @@
                 <w:szCs w:val="20"/>
                 <w:color w:val="000000"/>
               </w:rPr>
+              <w:t xml:space="preserve"/>
+            </w:r>
+          </w:p>
+        </w:tc>
+        <w:tc>
+          <w:tcPr>
+            <w:tcBorders>
+              <w:bottom w:val="single" w:sz="6" w:space="0" w:color="BEBEBE"/>
+              <w:top w:val="single" w:sz="6" w:space="0" w:color="BEBEBE"/>
+              <w:left w:val="none" w:sz="0" w:space="0" w:color="000000"/>
+              <w:right w:val="none" w:sz="0" w:space="0" w:color="000000"/>
+            </w:tcBorders>
+            <w:shd w:val="clear" w:color="auto" w:fill="FFFFFF"/>
+            <w:tcMar>
+              <w:top w:w="0" w:type="dxa"/>
+              <w:bottom w:w="0" w:type="dxa"/>
+              <w:left w:w="0" w:type="dxa"/>
+              <w:right w:w="0" w:type="dxa"/>
+            </w:tcMar>
+            <w:vAlign w:val="center"/>
+          </w:tcPr>
+          <w:p>
+            <w:pPr>
+              <w:jc w:val="right"/>
+              <w:pBdr>
+                <w:bottom w:val="none" w:sz="0" w:space="0" w:color="000000"/>
+                <w:top w:val="none" w:sz="0" w:space="0" w:color="000000"/>
+                <w:left w:val="none" w:sz="0" w:space="0" w:color="000000"/>
+                <w:right w:val="none" w:sz="0" w:space="0" w:color="000000"/>
+              </w:pBdr>
+              <w:spacing w:after="100" w:before="100" w:line="240"/>
+              <w:ind w:left="100" w:right="100" w:firstLine="0" w:firstLineChars="0"/>
+              <w:rPr>
+                <w:rFonts w:ascii="Arial" w:hAnsi="Helvetica" w:eastAsia="Helvetica" w:cs="Helvetica"/>
+                <w:i w:val="false"/>
+                <w:b w:val="false"/>
+                <w:u w:val="none"/>
+                <w:strike w:val="false"/>
+                <w:sz w:val="20"/>
+                <w:szCs w:val="20"/>
+                <w:color w:val="000000"/>
+              </w:rPr>
+            </w:pPr>
+            <w:r>
+              <w:rPr>
+                <w:rFonts w:ascii="Arial" w:hAnsi="Helvetica" w:eastAsia="Helvetica" w:cs="Helvetica"/>
+                <w:i w:val="false"/>
+                <w:b w:val="false"/>
+                <w:u w:val="none"/>
+                <w:strike w:val="false"/>
+                <w:sz w:val="20"/>
+                <w:szCs w:val="20"/>
+                <w:color w:val="000000"/>
+              </w:rPr>
               <w:t xml:space="preserve">34</w:t>
             </w:r>
           </w:p>
@@ -3169,6 +3386,60 @@
                 <w:szCs w:val="20"/>
                 <w:color w:val="000000"/>
               </w:rPr>
+              <w:t xml:space="preserve"/>
+            </w:r>
+          </w:p>
+        </w:tc>
+        <w:tc>
+          <w:tcPr>
+            <w:tcBorders>
+              <w:bottom w:val="single" w:sz="6" w:space="0" w:color="BEBEBE"/>
+              <w:top w:val="single" w:sz="6" w:space="0" w:color="BEBEBE"/>
+              <w:left w:val="none" w:sz="0" w:space="0" w:color="000000"/>
+              <w:right w:val="none" w:sz="0" w:space="0" w:color="000000"/>
+            </w:tcBorders>
+            <w:shd w:val="clear" w:color="auto" w:fill="FFFFFF"/>
+            <w:tcMar>
+              <w:top w:w="0" w:type="dxa"/>
+              <w:bottom w:w="0" w:type="dxa"/>
+              <w:left w:w="0" w:type="dxa"/>
+              <w:right w:w="0" w:type="dxa"/>
+            </w:tcMar>
+            <w:vAlign w:val="center"/>
+          </w:tcPr>
+          <w:p>
+            <w:pPr>
+              <w:jc w:val="right"/>
+              <w:pBdr>
+                <w:bottom w:val="none" w:sz="0" w:space="0" w:color="000000"/>
+                <w:top w:val="none" w:sz="0" w:space="0" w:color="000000"/>
+                <w:left w:val="none" w:sz="0" w:space="0" w:color="000000"/>
+                <w:right w:val="none" w:sz="0" w:space="0" w:color="000000"/>
+              </w:pBdr>
+              <w:spacing w:after="100" w:before="100" w:line="240"/>
+              <w:ind w:left="100" w:right="100" w:firstLine="0" w:firstLineChars="0"/>
+              <w:rPr>
+                <w:rFonts w:ascii="Arial" w:hAnsi="Helvetica" w:eastAsia="Helvetica" w:cs="Helvetica"/>
+                <w:i w:val="false"/>
+                <w:b w:val="false"/>
+                <w:u w:val="none"/>
+                <w:strike w:val="false"/>
+                <w:sz w:val="20"/>
+                <w:szCs w:val="20"/>
+                <w:color w:val="000000"/>
+              </w:rPr>
+            </w:pPr>
+            <w:r>
+              <w:rPr>
+                <w:rFonts w:ascii="Arial" w:hAnsi="Helvetica" w:eastAsia="Helvetica" w:cs="Helvetica"/>
+                <w:i w:val="false"/>
+                <w:b w:val="false"/>
+                <w:u w:val="none"/>
+                <w:strike w:val="false"/>
+                <w:sz w:val="20"/>
+                <w:szCs w:val="20"/>
+                <w:color w:val="000000"/>
+              </w:rPr>
               <w:t xml:space="preserve">33</w:t>
             </w:r>
           </w:p>
@@ -3819,6 +4090,60 @@
                 <w:szCs w:val="20"/>
                 <w:color w:val="000000"/>
               </w:rPr>
+              <w:t xml:space="preserve">9</w:t>
+            </w:r>
+          </w:p>
+        </w:tc>
+        <w:tc>
+          <w:tcPr>
+            <w:tcBorders>
+              <w:bottom w:val="single" w:sz="6" w:space="0" w:color="BEBEBE"/>
+              <w:top w:val="single" w:sz="6" w:space="0" w:color="BEBEBE"/>
+              <w:left w:val="none" w:sz="0" w:space="0" w:color="000000"/>
+              <w:right w:val="none" w:sz="0" w:space="0" w:color="000000"/>
+            </w:tcBorders>
+            <w:shd w:val="clear" w:color="auto" w:fill="FFFFFF"/>
+            <w:tcMar>
+              <w:top w:w="0" w:type="dxa"/>
+              <w:bottom w:w="0" w:type="dxa"/>
+              <w:left w:w="0" w:type="dxa"/>
+              <w:right w:w="0" w:type="dxa"/>
+            </w:tcMar>
+            <w:vAlign w:val="center"/>
+          </w:tcPr>
+          <w:p>
+            <w:pPr>
+              <w:jc w:val="right"/>
+              <w:pBdr>
+                <w:bottom w:val="none" w:sz="0" w:space="0" w:color="000000"/>
+                <w:top w:val="none" w:sz="0" w:space="0" w:color="000000"/>
+                <w:left w:val="none" w:sz="0" w:space="0" w:color="000000"/>
+                <w:right w:val="none" w:sz="0" w:space="0" w:color="000000"/>
+              </w:pBdr>
+              <w:spacing w:after="100" w:before="100" w:line="240"/>
+              <w:ind w:left="100" w:right="100" w:firstLine="0" w:firstLineChars="0"/>
+              <w:rPr>
+                <w:rFonts w:ascii="Arial" w:hAnsi="Helvetica" w:eastAsia="Helvetica" w:cs="Helvetica"/>
+                <w:i w:val="false"/>
+                <w:b w:val="false"/>
+                <w:u w:val="none"/>
+                <w:strike w:val="false"/>
+                <w:sz w:val="20"/>
+                <w:szCs w:val="20"/>
+                <w:color w:val="000000"/>
+              </w:rPr>
+            </w:pPr>
+            <w:r>
+              <w:rPr>
+                <w:rFonts w:ascii="Arial" w:hAnsi="Helvetica" w:eastAsia="Helvetica" w:cs="Helvetica"/>
+                <w:i w:val="false"/>
+                <w:b w:val="false"/>
+                <w:u w:val="none"/>
+                <w:strike w:val="false"/>
+                <w:sz w:val="20"/>
+                <w:szCs w:val="20"/>
+                <w:color w:val="000000"/>
+              </w:rPr>
               <w:t xml:space="preserve">16</w:t>
             </w:r>
           </w:p>
@@ -4443,6 +4768,60 @@
                 <w:szCs w:val="20"/>
                 <w:color w:val="000000"/>
               </w:rPr>
+              <w:t xml:space="preserve">10</w:t>
+            </w:r>
+          </w:p>
+        </w:tc>
+        <w:tc>
+          <w:tcPr>
+            <w:tcBorders>
+              <w:bottom w:val="single" w:sz="6" w:space="0" w:color="BEBEBE"/>
+              <w:top w:val="single" w:sz="6" w:space="0" w:color="BEBEBE"/>
+              <w:left w:val="none" w:sz="0" w:space="0" w:color="000000"/>
+              <w:right w:val="none" w:sz="0" w:space="0" w:color="000000"/>
+            </w:tcBorders>
+            <w:shd w:val="clear" w:color="auto" w:fill="FFFFFF"/>
+            <w:tcMar>
+              <w:top w:w="0" w:type="dxa"/>
+              <w:bottom w:w="0" w:type="dxa"/>
+              <w:left w:w="0" w:type="dxa"/>
+              <w:right w:w="0" w:type="dxa"/>
+            </w:tcMar>
+            <w:vAlign w:val="center"/>
+          </w:tcPr>
+          <w:p>
+            <w:pPr>
+              <w:jc w:val="right"/>
+              <w:pBdr>
+                <w:bottom w:val="none" w:sz="0" w:space="0" w:color="000000"/>
+                <w:top w:val="none" w:sz="0" w:space="0" w:color="000000"/>
+                <w:left w:val="none" w:sz="0" w:space="0" w:color="000000"/>
+                <w:right w:val="none" w:sz="0" w:space="0" w:color="000000"/>
+              </w:pBdr>
+              <w:spacing w:after="100" w:before="100" w:line="240"/>
+              <w:ind w:left="100" w:right="100" w:firstLine="0" w:firstLineChars="0"/>
+              <w:rPr>
+                <w:rFonts w:ascii="Arial" w:hAnsi="Helvetica" w:eastAsia="Helvetica" w:cs="Helvetica"/>
+                <w:i w:val="false"/>
+                <w:b w:val="false"/>
+                <w:u w:val="none"/>
+                <w:strike w:val="false"/>
+                <w:sz w:val="20"/>
+                <w:szCs w:val="20"/>
+                <w:color w:val="000000"/>
+              </w:rPr>
+            </w:pPr>
+            <w:r>
+              <w:rPr>
+                <w:rFonts w:ascii="Arial" w:hAnsi="Helvetica" w:eastAsia="Helvetica" w:cs="Helvetica"/>
+                <w:i w:val="false"/>
+                <w:b w:val="false"/>
+                <w:u w:val="none"/>
+                <w:strike w:val="false"/>
+                <w:sz w:val="20"/>
+                <w:szCs w:val="20"/>
+                <w:color w:val="000000"/>
+              </w:rPr>
               <w:t xml:space="preserve">18</w:t>
             </w:r>
           </w:p>
@@ -5067,6 +5446,60 @@
                 <w:szCs w:val="20"/>
                 <w:color w:val="000000"/>
               </w:rPr>
+              <w:t xml:space="preserve"/>
+            </w:r>
+          </w:p>
+        </w:tc>
+        <w:tc>
+          <w:tcPr>
+            <w:tcBorders>
+              <w:bottom w:val="single" w:sz="6" w:space="0" w:color="BEBEBE"/>
+              <w:top w:val="single" w:sz="6" w:space="0" w:color="BEBEBE"/>
+              <w:left w:val="none" w:sz="0" w:space="0" w:color="000000"/>
+              <w:right w:val="none" w:sz="0" w:space="0" w:color="000000"/>
+            </w:tcBorders>
+            <w:shd w:val="clear" w:color="auto" w:fill="FFFFFF"/>
+            <w:tcMar>
+              <w:top w:w="0" w:type="dxa"/>
+              <w:bottom w:w="0" w:type="dxa"/>
+              <w:left w:w="0" w:type="dxa"/>
+              <w:right w:w="0" w:type="dxa"/>
+            </w:tcMar>
+            <w:vAlign w:val="center"/>
+          </w:tcPr>
+          <w:p>
+            <w:pPr>
+              <w:jc w:val="right"/>
+              <w:pBdr>
+                <w:bottom w:val="none" w:sz="0" w:space="0" w:color="000000"/>
+                <w:top w:val="none" w:sz="0" w:space="0" w:color="000000"/>
+                <w:left w:val="none" w:sz="0" w:space="0" w:color="000000"/>
+                <w:right w:val="none" w:sz="0" w:space="0" w:color="000000"/>
+              </w:pBdr>
+              <w:spacing w:after="100" w:before="100" w:line="240"/>
+              <w:ind w:left="100" w:right="100" w:firstLine="0" w:firstLineChars="0"/>
+              <w:rPr>
+                <w:rFonts w:ascii="Arial" w:hAnsi="Helvetica" w:eastAsia="Helvetica" w:cs="Helvetica"/>
+                <w:i w:val="false"/>
+                <w:b w:val="false"/>
+                <w:u w:val="none"/>
+                <w:strike w:val="false"/>
+                <w:sz w:val="20"/>
+                <w:szCs w:val="20"/>
+                <w:color w:val="000000"/>
+              </w:rPr>
+            </w:pPr>
+            <w:r>
+              <w:rPr>
+                <w:rFonts w:ascii="Arial" w:hAnsi="Helvetica" w:eastAsia="Helvetica" w:cs="Helvetica"/>
+                <w:i w:val="false"/>
+                <w:b w:val="false"/>
+                <w:u w:val="none"/>
+                <w:strike w:val="false"/>
+                <w:sz w:val="20"/>
+                <w:szCs w:val="20"/>
+                <w:color w:val="000000"/>
+              </w:rPr>
               <w:t xml:space="preserve">5</w:t>
             </w:r>
           </w:p>
@@ -5691,6 +6124,60 @@
                 <w:szCs w:val="20"/>
                 <w:color w:val="000000"/>
               </w:rPr>
+              <w:t xml:space="preserve">0</w:t>
+            </w:r>
+          </w:p>
+        </w:tc>
+        <w:tc>
+          <w:tcPr>
+            <w:tcBorders>
+              <w:bottom w:val="single" w:sz="6" w:space="0" w:color="BEBEBE"/>
+              <w:top w:val="single" w:sz="6" w:space="0" w:color="BEBEBE"/>
+              <w:left w:val="none" w:sz="0" w:space="0" w:color="000000"/>
+              <w:right w:val="none" w:sz="0" w:space="0" w:color="000000"/>
+            </w:tcBorders>
+            <w:shd w:val="clear" w:color="auto" w:fill="FFFFFF"/>
+            <w:tcMar>
+              <w:top w:w="0" w:type="dxa"/>
+              <w:bottom w:w="0" w:type="dxa"/>
+              <w:left w:w="0" w:type="dxa"/>
+              <w:right w:w="0" w:type="dxa"/>
+            </w:tcMar>
+            <w:vAlign w:val="center"/>
+          </w:tcPr>
+          <w:p>
+            <w:pPr>
+              <w:jc w:val="right"/>
+              <w:pBdr>
+                <w:bottom w:val="none" w:sz="0" w:space="0" w:color="000000"/>
+                <w:top w:val="none" w:sz="0" w:space="0" w:color="000000"/>
+                <w:left w:val="none" w:sz="0" w:space="0" w:color="000000"/>
+                <w:right w:val="none" w:sz="0" w:space="0" w:color="000000"/>
+              </w:pBdr>
+              <w:spacing w:after="100" w:before="100" w:line="240"/>
+              <w:ind w:left="100" w:right="100" w:firstLine="0" w:firstLineChars="0"/>
+              <w:rPr>
+                <w:rFonts w:ascii="Arial" w:hAnsi="Helvetica" w:eastAsia="Helvetica" w:cs="Helvetica"/>
+                <w:i w:val="false"/>
+                <w:b w:val="false"/>
+                <w:u w:val="none"/>
+                <w:strike w:val="false"/>
+                <w:sz w:val="20"/>
+                <w:szCs w:val="20"/>
+                <w:color w:val="000000"/>
+              </w:rPr>
+            </w:pPr>
+            <w:r>
+              <w:rPr>
+                <w:rFonts w:ascii="Arial" w:hAnsi="Helvetica" w:eastAsia="Helvetica" w:cs="Helvetica"/>
+                <w:i w:val="false"/>
+                <w:b w:val="false"/>
+                <w:u w:val="none"/>
+                <w:strike w:val="false"/>
+                <w:sz w:val="20"/>
+                <w:szCs w:val="20"/>
+                <w:color w:val="000000"/>
+              </w:rPr>
               <w:t xml:space="preserve">10</w:t>
             </w:r>
           </w:p>
@@ -6315,6 +6802,60 @@
                 <w:szCs w:val="20"/>
                 <w:color w:val="000000"/>
               </w:rPr>
+              <w:t xml:space="preserve"/>
+            </w:r>
+          </w:p>
+        </w:tc>
+        <w:tc>
+          <w:tcPr>
+            <w:tcBorders>
+              <w:bottom w:val="single" w:sz="6" w:space="0" w:color="BEBEBE"/>
+              <w:top w:val="single" w:sz="6" w:space="0" w:color="BEBEBE"/>
+              <w:left w:val="none" w:sz="0" w:space="0" w:color="000000"/>
+              <w:right w:val="none" w:sz="0" w:space="0" w:color="000000"/>
+            </w:tcBorders>
+            <w:shd w:val="clear" w:color="auto" w:fill="FFFFFF"/>
+            <w:tcMar>
+              <w:top w:w="0" w:type="dxa"/>
+              <w:bottom w:w="0" w:type="dxa"/>
+              <w:left w:w="0" w:type="dxa"/>
+              <w:right w:w="0" w:type="dxa"/>
+            </w:tcMar>
+            <w:vAlign w:val="center"/>
+          </w:tcPr>
+          <w:p>
+            <w:pPr>
+              <w:jc w:val="right"/>
+              <w:pBdr>
+                <w:bottom w:val="none" w:sz="0" w:space="0" w:color="000000"/>
+                <w:top w:val="none" w:sz="0" w:space="0" w:color="000000"/>
+                <w:left w:val="none" w:sz="0" w:space="0" w:color="000000"/>
+                <w:right w:val="none" w:sz="0" w:space="0" w:color="000000"/>
+              </w:pBdr>
+              <w:spacing w:after="100" w:before="100" w:line="240"/>
+              <w:ind w:left="100" w:right="100" w:firstLine="0" w:firstLineChars="0"/>
+              <w:rPr>
+                <w:rFonts w:ascii="Arial" w:hAnsi="Helvetica" w:eastAsia="Helvetica" w:cs="Helvetica"/>
+                <w:i w:val="false"/>
+                <w:b w:val="false"/>
+                <w:u w:val="none"/>
+                <w:strike w:val="false"/>
+                <w:sz w:val="20"/>
+                <w:szCs w:val="20"/>
+                <w:color w:val="000000"/>
+              </w:rPr>
+            </w:pPr>
+            <w:r>
+              <w:rPr>
+                <w:rFonts w:ascii="Arial" w:hAnsi="Helvetica" w:eastAsia="Helvetica" w:cs="Helvetica"/>
+                <w:i w:val="false"/>
+                <w:b w:val="false"/>
+                <w:u w:val="none"/>
+                <w:strike w:val="false"/>
+                <w:sz w:val="20"/>
+                <w:szCs w:val="20"/>
+                <w:color w:val="000000"/>
+              </w:rPr>
               <w:t xml:space="preserve">17</w:t>
             </w:r>
           </w:p>
@@ -6939,6 +7480,60 @@
                 <w:szCs w:val="20"/>
                 <w:color w:val="000000"/>
               </w:rPr>
+              <w:t xml:space="preserve"/>
+            </w:r>
+          </w:p>
+        </w:tc>
+        <w:tc>
+          <w:tcPr>
+            <w:tcBorders>
+              <w:bottom w:val="single" w:sz="6" w:space="0" w:color="BEBEBE"/>
+              <w:top w:val="single" w:sz="6" w:space="0" w:color="BEBEBE"/>
+              <w:left w:val="none" w:sz="0" w:space="0" w:color="000000"/>
+              <w:right w:val="none" w:sz="0" w:space="0" w:color="000000"/>
+            </w:tcBorders>
+            <w:shd w:val="clear" w:color="auto" w:fill="FFFFFF"/>
+            <w:tcMar>
+              <w:top w:w="0" w:type="dxa"/>
+              <w:bottom w:w="0" w:type="dxa"/>
+              <w:left w:w="0" w:type="dxa"/>
+              <w:right w:w="0" w:type="dxa"/>
+            </w:tcMar>
+            <w:vAlign w:val="center"/>
+          </w:tcPr>
+          <w:p>
+            <w:pPr>
+              <w:jc w:val="right"/>
+              <w:pBdr>
+                <w:bottom w:val="none" w:sz="0" w:space="0" w:color="000000"/>
+                <w:top w:val="none" w:sz="0" w:space="0" w:color="000000"/>
+                <w:left w:val="none" w:sz="0" w:space="0" w:color="000000"/>
+                <w:right w:val="none" w:sz="0" w:space="0" w:color="000000"/>
+              </w:pBdr>
+              <w:spacing w:after="100" w:before="100" w:line="240"/>
+              <w:ind w:left="100" w:right="100" w:firstLine="0" w:firstLineChars="0"/>
+              <w:rPr>
+                <w:rFonts w:ascii="Arial" w:hAnsi="Helvetica" w:eastAsia="Helvetica" w:cs="Helvetica"/>
+                <w:i w:val="false"/>
+                <w:b w:val="false"/>
+                <w:u w:val="none"/>
+                <w:strike w:val="false"/>
+                <w:sz w:val="20"/>
+                <w:szCs w:val="20"/>
+                <w:color w:val="000000"/>
+              </w:rPr>
+            </w:pPr>
+            <w:r>
+              <w:rPr>
+                <w:rFonts w:ascii="Arial" w:hAnsi="Helvetica" w:eastAsia="Helvetica" w:cs="Helvetica"/>
+                <w:i w:val="false"/>
+                <w:b w:val="false"/>
+                <w:u w:val="none"/>
+                <w:strike w:val="false"/>
+                <w:sz w:val="20"/>
+                <w:szCs w:val="20"/>
+                <w:color w:val="000000"/>
+              </w:rPr>
               <w:t xml:space="preserve">7</w:t>
             </w:r>
           </w:p>
@@ -7563,6 +8158,60 @@
                 <w:szCs w:val="20"/>
                 <w:color w:val="000000"/>
               </w:rPr>
+              <w:t xml:space="preserve">0</w:t>
+            </w:r>
+          </w:p>
+        </w:tc>
+        <w:tc>
+          <w:tcPr>
+            <w:tcBorders>
+              <w:bottom w:val="single" w:sz="6" w:space="0" w:color="BEBEBE"/>
+              <w:top w:val="single" w:sz="6" w:space="0" w:color="BEBEBE"/>
+              <w:left w:val="none" w:sz="0" w:space="0" w:color="000000"/>
+              <w:right w:val="none" w:sz="0" w:space="0" w:color="000000"/>
+            </w:tcBorders>
+            <w:shd w:val="clear" w:color="auto" w:fill="FFFFFF"/>
+            <w:tcMar>
+              <w:top w:w="0" w:type="dxa"/>
+              <w:bottom w:w="0" w:type="dxa"/>
+              <w:left w:w="0" w:type="dxa"/>
+              <w:right w:w="0" w:type="dxa"/>
+            </w:tcMar>
+            <w:vAlign w:val="center"/>
+          </w:tcPr>
+          <w:p>
+            <w:pPr>
+              <w:jc w:val="right"/>
+              <w:pBdr>
+                <w:bottom w:val="none" w:sz="0" w:space="0" w:color="000000"/>
+                <w:top w:val="none" w:sz="0" w:space="0" w:color="000000"/>
+                <w:left w:val="none" w:sz="0" w:space="0" w:color="000000"/>
+                <w:right w:val="none" w:sz="0" w:space="0" w:color="000000"/>
+              </w:pBdr>
+              <w:spacing w:after="100" w:before="100" w:line="240"/>
+              <w:ind w:left="100" w:right="100" w:firstLine="0" w:firstLineChars="0"/>
+              <w:rPr>
+                <w:rFonts w:ascii="Arial" w:hAnsi="Helvetica" w:eastAsia="Helvetica" w:cs="Helvetica"/>
+                <w:i w:val="false"/>
+                <w:b w:val="false"/>
+                <w:u w:val="none"/>
+                <w:strike w:val="false"/>
+                <w:sz w:val="20"/>
+                <w:szCs w:val="20"/>
+                <w:color w:val="000000"/>
+              </w:rPr>
+            </w:pPr>
+            <w:r>
+              <w:rPr>
+                <w:rFonts w:ascii="Arial" w:hAnsi="Helvetica" w:eastAsia="Helvetica" w:cs="Helvetica"/>
+                <w:i w:val="false"/>
+                <w:b w:val="false"/>
+                <w:u w:val="none"/>
+                <w:strike w:val="false"/>
+                <w:sz w:val="20"/>
+                <w:szCs w:val="20"/>
+                <w:color w:val="000000"/>
+              </w:rPr>
               <w:t xml:space="preserve">31</w:t>
             </w:r>
           </w:p>
@@ -8161,6 +8810,60 @@
                 <w:szCs w:val="20"/>
                 <w:color w:val="000000"/>
               </w:rPr>
+              <w:t xml:space="preserve"/>
+            </w:r>
+          </w:p>
+        </w:tc>
+        <w:tc>
+          <w:tcPr>
+            <w:tcBorders>
+              <w:bottom w:val="single" w:sz="6" w:space="0" w:color="BEBEBE"/>
+              <w:top w:val="single" w:sz="6" w:space="0" w:color="BEBEBE"/>
+              <w:left w:val="none" w:sz="0" w:space="0" w:color="000000"/>
+              <w:right w:val="none" w:sz="0" w:space="0" w:color="000000"/>
+            </w:tcBorders>
+            <w:shd w:val="clear" w:color="auto" w:fill="FFFFFF"/>
+            <w:tcMar>
+              <w:top w:w="0" w:type="dxa"/>
+              <w:bottom w:w="0" w:type="dxa"/>
+              <w:left w:w="0" w:type="dxa"/>
+              <w:right w:w="0" w:type="dxa"/>
+            </w:tcMar>
+            <w:vAlign w:val="center"/>
+          </w:tcPr>
+          <w:p>
+            <w:pPr>
+              <w:jc w:val="right"/>
+              <w:pBdr>
+                <w:bottom w:val="none" w:sz="0" w:space="0" w:color="000000"/>
+                <w:top w:val="none" w:sz="0" w:space="0" w:color="000000"/>
+                <w:left w:val="none" w:sz="0" w:space="0" w:color="000000"/>
+                <w:right w:val="none" w:sz="0" w:space="0" w:color="000000"/>
+              </w:pBdr>
+              <w:spacing w:after="100" w:before="100" w:line="240"/>
+              <w:ind w:left="100" w:right="100" w:firstLine="0" w:firstLineChars="0"/>
+              <w:rPr>
+                <w:rFonts w:ascii="Arial" w:hAnsi="Helvetica" w:eastAsia="Helvetica" w:cs="Helvetica"/>
+                <w:i w:val="false"/>
+                <w:b w:val="false"/>
+                <w:u w:val="none"/>
+                <w:strike w:val="false"/>
+                <w:sz w:val="20"/>
+                <w:szCs w:val="20"/>
+                <w:color w:val="000000"/>
+              </w:rPr>
+            </w:pPr>
+            <w:r>
+              <w:rPr>
+                <w:rFonts w:ascii="Arial" w:hAnsi="Helvetica" w:eastAsia="Helvetica" w:cs="Helvetica"/>
+                <w:i w:val="false"/>
+                <w:b w:val="false"/>
+                <w:u w:val="none"/>
+                <w:strike w:val="false"/>
+                <w:sz w:val="20"/>
+                <w:szCs w:val="20"/>
+                <w:color w:val="000000"/>
+              </w:rPr>
               <w:t xml:space="preserve">8</w:t>
             </w:r>
           </w:p>
@@ -8811,6 +9514,60 @@
                 <w:szCs w:val="20"/>
                 <w:color w:val="000000"/>
               </w:rPr>
+              <w:t xml:space="preserve">21</w:t>
+            </w:r>
+          </w:p>
+        </w:tc>
+        <w:tc>
+          <w:tcPr>
+            <w:tcBorders>
+              <w:bottom w:val="single" w:sz="6" w:space="0" w:color="BEBEBE"/>
+              <w:top w:val="single" w:sz="6" w:space="0" w:color="BEBEBE"/>
+              <w:left w:val="none" w:sz="0" w:space="0" w:color="000000"/>
+              <w:right w:val="none" w:sz="0" w:space="0" w:color="000000"/>
+            </w:tcBorders>
+            <w:shd w:val="clear" w:color="auto" w:fill="FFFFFF"/>
+            <w:tcMar>
+              <w:top w:w="0" w:type="dxa"/>
+              <w:bottom w:w="0" w:type="dxa"/>
+              <w:left w:w="0" w:type="dxa"/>
+              <w:right w:w="0" w:type="dxa"/>
+            </w:tcMar>
+            <w:vAlign w:val="center"/>
+          </w:tcPr>
+          <w:p>
+            <w:pPr>
+              <w:jc w:val="right"/>
+              <w:pBdr>
+                <w:bottom w:val="none" w:sz="0" w:space="0" w:color="000000"/>
+                <w:top w:val="none" w:sz="0" w:space="0" w:color="000000"/>
+                <w:left w:val="none" w:sz="0" w:space="0" w:color="000000"/>
+                <w:right w:val="none" w:sz="0" w:space="0" w:color="000000"/>
+              </w:pBdr>
+              <w:spacing w:after="100" w:before="100" w:line="240"/>
+              <w:ind w:left="100" w:right="100" w:firstLine="0" w:firstLineChars="0"/>
+              <w:rPr>
+                <w:rFonts w:ascii="Arial" w:hAnsi="Helvetica" w:eastAsia="Helvetica" w:cs="Helvetica"/>
+                <w:i w:val="false"/>
+                <w:b w:val="false"/>
+                <w:u w:val="none"/>
+                <w:strike w:val="false"/>
+                <w:sz w:val="20"/>
+                <w:szCs w:val="20"/>
+                <w:color w:val="000000"/>
+              </w:rPr>
+            </w:pPr>
+            <w:r>
+              <w:rPr>
+                <w:rFonts w:ascii="Arial" w:hAnsi="Helvetica" w:eastAsia="Helvetica" w:cs="Helvetica"/>
+                <w:i w:val="false"/>
+                <w:b w:val="false"/>
+                <w:u w:val="none"/>
+                <w:strike w:val="false"/>
+                <w:sz w:val="20"/>
+                <w:szCs w:val="20"/>
+                <w:color w:val="000000"/>
+              </w:rPr>
               <w:t xml:space="preserve">20</w:t>
             </w:r>
           </w:p>
@@ -9435,6 +10192,60 @@
                 <w:szCs w:val="20"/>
                 <w:color w:val="000000"/>
               </w:rPr>
+              <w:t xml:space="preserve">36</w:t>
+            </w:r>
+          </w:p>
+        </w:tc>
+        <w:tc>
+          <w:tcPr>
+            <w:tcBorders>
+              <w:bottom w:val="single" w:sz="6" w:space="0" w:color="BEBEBE"/>
+              <w:top w:val="single" w:sz="6" w:space="0" w:color="BEBEBE"/>
+              <w:left w:val="none" w:sz="0" w:space="0" w:color="000000"/>
+              <w:right w:val="none" w:sz="0" w:space="0" w:color="000000"/>
+            </w:tcBorders>
+            <w:shd w:val="clear" w:color="auto" w:fill="FFFFFF"/>
+            <w:tcMar>
+              <w:top w:w="0" w:type="dxa"/>
+              <w:bottom w:w="0" w:type="dxa"/>
+              <w:left w:w="0" w:type="dxa"/>
+              <w:right w:w="0" w:type="dxa"/>
+            </w:tcMar>
+            <w:vAlign w:val="center"/>
+          </w:tcPr>
+          <w:p>
+            <w:pPr>
+              <w:jc w:val="right"/>
+              <w:pBdr>
+                <w:bottom w:val="none" w:sz="0" w:space="0" w:color="000000"/>
+                <w:top w:val="none" w:sz="0" w:space="0" w:color="000000"/>
+                <w:left w:val="none" w:sz="0" w:space="0" w:color="000000"/>
+                <w:right w:val="none" w:sz="0" w:space="0" w:color="000000"/>
+              </w:pBdr>
+              <w:spacing w:after="100" w:before="100" w:line="240"/>
+              <w:ind w:left="100" w:right="100" w:firstLine="0" w:firstLineChars="0"/>
+              <w:rPr>
+                <w:rFonts w:ascii="Arial" w:hAnsi="Helvetica" w:eastAsia="Helvetica" w:cs="Helvetica"/>
+                <w:i w:val="false"/>
+                <w:b w:val="false"/>
+                <w:u w:val="none"/>
+                <w:strike w:val="false"/>
+                <w:sz w:val="20"/>
+                <w:szCs w:val="20"/>
+                <w:color w:val="000000"/>
+              </w:rPr>
+            </w:pPr>
+            <w:r>
+              <w:rPr>
+                <w:rFonts w:ascii="Arial" w:hAnsi="Helvetica" w:eastAsia="Helvetica" w:cs="Helvetica"/>
+                <w:i w:val="false"/>
+                <w:b w:val="false"/>
+                <w:u w:val="none"/>
+                <w:strike w:val="false"/>
+                <w:sz w:val="20"/>
+                <w:szCs w:val="20"/>
+                <w:color w:val="000000"/>
+              </w:rPr>
               <w:t xml:space="preserve">41</w:t>
             </w:r>
           </w:p>
@@ -10085,6 +10896,60 @@
                 <w:szCs w:val="20"/>
                 <w:color w:val="000000"/>
               </w:rPr>
+              <w:t xml:space="preserve">28</w:t>
+            </w:r>
+          </w:p>
+        </w:tc>
+        <w:tc>
+          <w:tcPr>
+            <w:tcBorders>
+              <w:bottom w:val="single" w:sz="6" w:space="0" w:color="BEBEBE"/>
+              <w:top w:val="single" w:sz="6" w:space="0" w:color="BEBEBE"/>
+              <w:left w:val="none" w:sz="0" w:space="0" w:color="000000"/>
+              <w:right w:val="none" w:sz="0" w:space="0" w:color="000000"/>
+            </w:tcBorders>
+            <w:shd w:val="clear" w:color="auto" w:fill="FFFFFF"/>
+            <w:tcMar>
+              <w:top w:w="0" w:type="dxa"/>
+              <w:bottom w:w="0" w:type="dxa"/>
+              <w:left w:w="0" w:type="dxa"/>
+              <w:right w:w="0" w:type="dxa"/>
+            </w:tcMar>
+            <w:vAlign w:val="center"/>
+          </w:tcPr>
+          <w:p>
+            <w:pPr>
+              <w:jc w:val="right"/>
+              <w:pBdr>
+                <w:bottom w:val="none" w:sz="0" w:space="0" w:color="000000"/>
+                <w:top w:val="none" w:sz="0" w:space="0" w:color="000000"/>
+                <w:left w:val="none" w:sz="0" w:space="0" w:color="000000"/>
+                <w:right w:val="none" w:sz="0" w:space="0" w:color="000000"/>
+              </w:pBdr>
+              <w:spacing w:after="100" w:before="100" w:line="240"/>
+              <w:ind w:left="100" w:right="100" w:firstLine="0" w:firstLineChars="0"/>
+              <w:rPr>
+                <w:rFonts w:ascii="Arial" w:hAnsi="Helvetica" w:eastAsia="Helvetica" w:cs="Helvetica"/>
+                <w:i w:val="false"/>
+                <w:b w:val="false"/>
+                <w:u w:val="none"/>
+                <w:strike w:val="false"/>
+                <w:sz w:val="20"/>
+                <w:szCs w:val="20"/>
+                <w:color w:val="000000"/>
+              </w:rPr>
+            </w:pPr>
+            <w:r>
+              <w:rPr>
+                <w:rFonts w:ascii="Arial" w:hAnsi="Helvetica" w:eastAsia="Helvetica" w:cs="Helvetica"/>
+                <w:i w:val="false"/>
+                <w:b w:val="false"/>
+                <w:u w:val="none"/>
+                <w:strike w:val="false"/>
+                <w:sz w:val="20"/>
+                <w:szCs w:val="20"/>
+                <w:color w:val="000000"/>
+              </w:rPr>
               <w:t xml:space="preserve">23</w:t>
             </w:r>
           </w:p>
@@ -10683,6 +11548,60 @@
                 <w:szCs w:val="20"/>
                 <w:color w:val="000000"/>
               </w:rPr>
+              <w:t xml:space="preserve">18</w:t>
+            </w:r>
+          </w:p>
+        </w:tc>
+        <w:tc>
+          <w:tcPr>
+            <w:tcBorders>
+              <w:bottom w:val="single" w:sz="6" w:space="0" w:color="BEBEBE"/>
+              <w:top w:val="single" w:sz="6" w:space="0" w:color="BEBEBE"/>
+              <w:left w:val="none" w:sz="0" w:space="0" w:color="000000"/>
+              <w:right w:val="none" w:sz="0" w:space="0" w:color="000000"/>
+            </w:tcBorders>
+            <w:shd w:val="clear" w:color="auto" w:fill="FFFFFF"/>
+            <w:tcMar>
+              <w:top w:w="0" w:type="dxa"/>
+              <w:bottom w:w="0" w:type="dxa"/>
+              <w:left w:w="0" w:type="dxa"/>
+              <w:right w:w="0" w:type="dxa"/>
+            </w:tcMar>
+            <w:vAlign w:val="center"/>
+          </w:tcPr>
+          <w:p>
+            <w:pPr>
+              <w:jc w:val="right"/>
+              <w:pBdr>
+                <w:bottom w:val="none" w:sz="0" w:space="0" w:color="000000"/>
+                <w:top w:val="none" w:sz="0" w:space="0" w:color="000000"/>
+                <w:left w:val="none" w:sz="0" w:space="0" w:color="000000"/>
+                <w:right w:val="none" w:sz="0" w:space="0" w:color="000000"/>
+              </w:pBdr>
+              <w:spacing w:after="100" w:before="100" w:line="240"/>
+              <w:ind w:left="100" w:right="100" w:firstLine="0" w:firstLineChars="0"/>
+              <w:rPr>
+                <w:rFonts w:ascii="Arial" w:hAnsi="Helvetica" w:eastAsia="Helvetica" w:cs="Helvetica"/>
+                <w:i w:val="false"/>
+                <w:b w:val="false"/>
+                <w:u w:val="none"/>
+                <w:strike w:val="false"/>
+                <w:sz w:val="20"/>
+                <w:szCs w:val="20"/>
+                <w:color w:val="000000"/>
+              </w:rPr>
+            </w:pPr>
+            <w:r>
+              <w:rPr>
+                <w:rFonts w:ascii="Arial" w:hAnsi="Helvetica" w:eastAsia="Helvetica" w:cs="Helvetica"/>
+                <w:i w:val="false"/>
+                <w:b w:val="false"/>
+                <w:u w:val="none"/>
+                <w:strike w:val="false"/>
+                <w:sz w:val="20"/>
+                <w:szCs w:val="20"/>
+                <w:color w:val="000000"/>
+              </w:rPr>
               <w:t xml:space="preserve">17</w:t>
             </w:r>
           </w:p>
@@ -11281,6 +12200,60 @@
                 <w:szCs w:val="20"/>
                 <w:color w:val="000000"/>
               </w:rPr>
+              <w:t xml:space="preserve">13</w:t>
+            </w:r>
+          </w:p>
+        </w:tc>
+        <w:tc>
+          <w:tcPr>
+            <w:tcBorders>
+              <w:bottom w:val="single" w:sz="6" w:space="0" w:color="BEBEBE"/>
+              <w:top w:val="single" w:sz="6" w:space="0" w:color="BEBEBE"/>
+              <w:left w:val="none" w:sz="0" w:space="0" w:color="000000"/>
+              <w:right w:val="none" w:sz="0" w:space="0" w:color="000000"/>
+            </w:tcBorders>
+            <w:shd w:val="clear" w:color="auto" w:fill="FFFFFF"/>
+            <w:tcMar>
+              <w:top w:w="0" w:type="dxa"/>
+              <w:bottom w:w="0" w:type="dxa"/>
+              <w:left w:w="0" w:type="dxa"/>
+              <w:right w:w="0" w:type="dxa"/>
+            </w:tcMar>
+            <w:vAlign w:val="center"/>
+          </w:tcPr>
+          <w:p>
+            <w:pPr>
+              <w:jc w:val="right"/>
+              <w:pBdr>
+                <w:bottom w:val="none" w:sz="0" w:space="0" w:color="000000"/>
+                <w:top w:val="none" w:sz="0" w:space="0" w:color="000000"/>
+                <w:left w:val="none" w:sz="0" w:space="0" w:color="000000"/>
+                <w:right w:val="none" w:sz="0" w:space="0" w:color="000000"/>
+              </w:pBdr>
+              <w:spacing w:after="100" w:before="100" w:line="240"/>
+              <w:ind w:left="100" w:right="100" w:firstLine="0" w:firstLineChars="0"/>
+              <w:rPr>
+                <w:rFonts w:ascii="Arial" w:hAnsi="Helvetica" w:eastAsia="Helvetica" w:cs="Helvetica"/>
+                <w:i w:val="false"/>
+                <w:b w:val="false"/>
+                <w:u w:val="none"/>
+                <w:strike w:val="false"/>
+                <w:sz w:val="20"/>
+                <w:szCs w:val="20"/>
+                <w:color w:val="000000"/>
+              </w:rPr>
+            </w:pPr>
+            <w:r>
+              <w:rPr>
+                <w:rFonts w:ascii="Arial" w:hAnsi="Helvetica" w:eastAsia="Helvetica" w:cs="Helvetica"/>
+                <w:i w:val="false"/>
+                <w:b w:val="false"/>
+                <w:u w:val="none"/>
+                <w:strike w:val="false"/>
+                <w:sz w:val="20"/>
+                <w:szCs w:val="20"/>
+                <w:color w:val="000000"/>
+              </w:rPr>
               <w:t xml:space="preserve">16</w:t>
             </w:r>
           </w:p>
@@ -11905,6 +12878,60 @@
                 <w:szCs w:val="20"/>
                 <w:color w:val="000000"/>
               </w:rPr>
+              <w:t xml:space="preserve"/>
+            </w:r>
+          </w:p>
+        </w:tc>
+        <w:tc>
+          <w:tcPr>
+            <w:tcBorders>
+              <w:bottom w:val="single" w:sz="6" w:space="0" w:color="BEBEBE"/>
+              <w:top w:val="single" w:sz="6" w:space="0" w:color="BEBEBE"/>
+              <w:left w:val="none" w:sz="0" w:space="0" w:color="000000"/>
+              <w:right w:val="none" w:sz="0" w:space="0" w:color="000000"/>
+            </w:tcBorders>
+            <w:shd w:val="clear" w:color="auto" w:fill="FFFFFF"/>
+            <w:tcMar>
+              <w:top w:w="0" w:type="dxa"/>
+              <w:bottom w:w="0" w:type="dxa"/>
+              <w:left w:w="0" w:type="dxa"/>
+              <w:right w:w="0" w:type="dxa"/>
+            </w:tcMar>
+            <w:vAlign w:val="center"/>
+          </w:tcPr>
+          <w:p>
+            <w:pPr>
+              <w:jc w:val="right"/>
+              <w:pBdr>
+                <w:bottom w:val="none" w:sz="0" w:space="0" w:color="000000"/>
+                <w:top w:val="none" w:sz="0" w:space="0" w:color="000000"/>
+                <w:left w:val="none" w:sz="0" w:space="0" w:color="000000"/>
+                <w:right w:val="none" w:sz="0" w:space="0" w:color="000000"/>
+              </w:pBdr>
+              <w:spacing w:after="100" w:before="100" w:line="240"/>
+              <w:ind w:left="100" w:right="100" w:firstLine="0" w:firstLineChars="0"/>
+              <w:rPr>
+                <w:rFonts w:ascii="Arial" w:hAnsi="Helvetica" w:eastAsia="Helvetica" w:cs="Helvetica"/>
+                <w:i w:val="false"/>
+                <w:b w:val="false"/>
+                <w:u w:val="none"/>
+                <w:strike w:val="false"/>
+                <w:sz w:val="20"/>
+                <w:szCs w:val="20"/>
+                <w:color w:val="000000"/>
+              </w:rPr>
+            </w:pPr>
+            <w:r>
+              <w:rPr>
+                <w:rFonts w:ascii="Arial" w:hAnsi="Helvetica" w:eastAsia="Helvetica" w:cs="Helvetica"/>
+                <w:i w:val="false"/>
+                <w:b w:val="false"/>
+                <w:u w:val="none"/>
+                <w:strike w:val="false"/>
+                <w:sz w:val="20"/>
+                <w:szCs w:val="20"/>
+                <w:color w:val="000000"/>
+              </w:rPr>
               <w:t xml:space="preserve">23</w:t>
             </w:r>
           </w:p>
@@ -12529,6 +13556,60 @@
                 <w:szCs w:val="20"/>
                 <w:color w:val="000000"/>
               </w:rPr>
+              <w:t xml:space="preserve"/>
+            </w:r>
+          </w:p>
+        </w:tc>
+        <w:tc>
+          <w:tcPr>
+            <w:tcBorders>
+              <w:bottom w:val="single" w:sz="6" w:space="0" w:color="BEBEBE"/>
+              <w:top w:val="single" w:sz="6" w:space="0" w:color="BEBEBE"/>
+              <w:left w:val="none" w:sz="0" w:space="0" w:color="000000"/>
+              <w:right w:val="none" w:sz="0" w:space="0" w:color="000000"/>
+            </w:tcBorders>
+            <w:shd w:val="clear" w:color="auto" w:fill="FFFFFF"/>
+            <w:tcMar>
+              <w:top w:w="0" w:type="dxa"/>
+              <w:bottom w:w="0" w:type="dxa"/>
+              <w:left w:w="0" w:type="dxa"/>
+              <w:right w:w="0" w:type="dxa"/>
+            </w:tcMar>
+            <w:vAlign w:val="center"/>
+          </w:tcPr>
+          <w:p>
+            <w:pPr>
+              <w:jc w:val="right"/>
+              <w:pBdr>
+                <w:bottom w:val="none" w:sz="0" w:space="0" w:color="000000"/>
+                <w:top w:val="none" w:sz="0" w:space="0" w:color="000000"/>
+                <w:left w:val="none" w:sz="0" w:space="0" w:color="000000"/>
+                <w:right w:val="none" w:sz="0" w:space="0" w:color="000000"/>
+              </w:pBdr>
+              <w:spacing w:after="100" w:before="100" w:line="240"/>
+              <w:ind w:left="100" w:right="100" w:firstLine="0" w:firstLineChars="0"/>
+              <w:rPr>
+                <w:rFonts w:ascii="Arial" w:hAnsi="Helvetica" w:eastAsia="Helvetica" w:cs="Helvetica"/>
+                <w:i w:val="false"/>
+                <w:b w:val="false"/>
+                <w:u w:val="none"/>
+                <w:strike w:val="false"/>
+                <w:sz w:val="20"/>
+                <w:szCs w:val="20"/>
+                <w:color w:val="000000"/>
+              </w:rPr>
+            </w:pPr>
+            <w:r>
+              <w:rPr>
+                <w:rFonts w:ascii="Arial" w:hAnsi="Helvetica" w:eastAsia="Helvetica" w:cs="Helvetica"/>
+                <w:i w:val="false"/>
+                <w:b w:val="false"/>
+                <w:u w:val="none"/>
+                <w:strike w:val="false"/>
+                <w:sz w:val="20"/>
+                <w:szCs w:val="20"/>
+                <w:color w:val="000000"/>
+              </w:rPr>
               <w:t xml:space="preserve">23</w:t>
             </w:r>
           </w:p>
@@ -13257,6 +14338,60 @@
                 <w:szCs w:val="20"/>
                 <w:color w:val="000000"/>
               </w:rPr>
+              <w:t xml:space="preserve">59</w:t>
+            </w:r>
+          </w:p>
+        </w:tc>
+        <w:tc>
+          <w:tcPr>
+            <w:tcBorders>
+              <w:bottom w:val="single" w:sz="6" w:space="0" w:color="BEBEBE"/>
+              <w:top w:val="single" w:sz="6" w:space="0" w:color="BEBEBE"/>
+              <w:left w:val="none" w:sz="0" w:space="0" w:color="000000"/>
+              <w:right w:val="none" w:sz="0" w:space="0" w:color="000000"/>
+            </w:tcBorders>
+            <w:shd w:val="clear" w:color="auto" w:fill="FFFFFF"/>
+            <w:tcMar>
+              <w:top w:w="0" w:type="dxa"/>
+              <w:bottom w:w="0" w:type="dxa"/>
+              <w:left w:w="0" w:type="dxa"/>
+              <w:right w:w="0" w:type="dxa"/>
+            </w:tcMar>
+            <w:vAlign w:val="center"/>
+          </w:tcPr>
+          <w:p>
+            <w:pPr>
+              <w:jc w:val="right"/>
+              <w:pBdr>
+                <w:bottom w:val="none" w:sz="0" w:space="0" w:color="000000"/>
+                <w:top w:val="none" w:sz="0" w:space="0" w:color="000000"/>
+                <w:left w:val="none" w:sz="0" w:space="0" w:color="000000"/>
+                <w:right w:val="none" w:sz="0" w:space="0" w:color="000000"/>
+              </w:pBdr>
+              <w:spacing w:after="100" w:before="100" w:line="240"/>
+              <w:ind w:left="100" w:right="100" w:firstLine="0" w:firstLineChars="0"/>
+              <w:rPr>
+                <w:rFonts w:ascii="Arial" w:hAnsi="Helvetica" w:eastAsia="Helvetica" w:cs="Helvetica"/>
+                <w:i w:val="false"/>
+                <w:b w:val="false"/>
+                <w:u w:val="none"/>
+                <w:strike w:val="false"/>
+                <w:sz w:val="20"/>
+                <w:szCs w:val="20"/>
+                <w:color w:val="000000"/>
+              </w:rPr>
+            </w:pPr>
+            <w:r>
+              <w:rPr>
+                <w:rFonts w:ascii="Arial" w:hAnsi="Helvetica" w:eastAsia="Helvetica" w:cs="Helvetica"/>
+                <w:i w:val="false"/>
+                <w:b w:val="false"/>
+                <w:u w:val="none"/>
+                <w:strike w:val="false"/>
+                <w:sz w:val="20"/>
+                <w:szCs w:val="20"/>
+                <w:color w:val="000000"/>
+              </w:rPr>
               <w:t xml:space="preserve">36</w:t>
             </w:r>
           </w:p>
@@ -13959,6 +15094,60 @@
                 <w:szCs w:val="20"/>
                 <w:color w:val="000000"/>
               </w:rPr>
+              <w:t xml:space="preserve">59</w:t>
+            </w:r>
+          </w:p>
+        </w:tc>
+        <w:tc>
+          <w:tcPr>
+            <w:tcBorders>
+              <w:bottom w:val="single" w:sz="6" w:space="0" w:color="BEBEBE"/>
+              <w:top w:val="single" w:sz="6" w:space="0" w:color="BEBEBE"/>
+              <w:left w:val="none" w:sz="0" w:space="0" w:color="000000"/>
+              <w:right w:val="none" w:sz="0" w:space="0" w:color="000000"/>
+            </w:tcBorders>
+            <w:shd w:val="clear" w:color="auto" w:fill="FFFFFF"/>
+            <w:tcMar>
+              <w:top w:w="0" w:type="dxa"/>
+              <w:bottom w:w="0" w:type="dxa"/>
+              <w:left w:w="0" w:type="dxa"/>
+              <w:right w:w="0" w:type="dxa"/>
+            </w:tcMar>
+            <w:vAlign w:val="center"/>
+          </w:tcPr>
+          <w:p>
+            <w:pPr>
+              <w:jc w:val="right"/>
+              <w:pBdr>
+                <w:bottom w:val="none" w:sz="0" w:space="0" w:color="000000"/>
+                <w:top w:val="none" w:sz="0" w:space="0" w:color="000000"/>
+                <w:left w:val="none" w:sz="0" w:space="0" w:color="000000"/>
+                <w:right w:val="none" w:sz="0" w:space="0" w:color="000000"/>
+              </w:pBdr>
+              <w:spacing w:after="100" w:before="100" w:line="240"/>
+              <w:ind w:left="100" w:right="100" w:firstLine="0" w:firstLineChars="0"/>
+              <w:rPr>
+                <w:rFonts w:ascii="Arial" w:hAnsi="Helvetica" w:eastAsia="Helvetica" w:cs="Helvetica"/>
+                <w:i w:val="false"/>
+                <w:b w:val="false"/>
+                <w:u w:val="none"/>
+                <w:strike w:val="false"/>
+                <w:sz w:val="20"/>
+                <w:szCs w:val="20"/>
+                <w:color w:val="000000"/>
+              </w:rPr>
+            </w:pPr>
+            <w:r>
+              <w:rPr>
+                <w:rFonts w:ascii="Arial" w:hAnsi="Helvetica" w:eastAsia="Helvetica" w:cs="Helvetica"/>
+                <w:i w:val="false"/>
+                <w:b w:val="false"/>
+                <w:u w:val="none"/>
+                <w:strike w:val="false"/>
+                <w:sz w:val="20"/>
+                <w:szCs w:val="20"/>
+                <w:color w:val="000000"/>
+              </w:rPr>
               <w:t xml:space="preserve">26</w:t>
             </w:r>
           </w:p>
@@ -14635,6 +15824,60 @@
                 <w:szCs w:val="20"/>
                 <w:color w:val="000000"/>
               </w:rPr>
+              <w:t xml:space="preserve">26</w:t>
+            </w:r>
+          </w:p>
+        </w:tc>
+        <w:tc>
+          <w:tcPr>
+            <w:tcBorders>
+              <w:bottom w:val="single" w:sz="6" w:space="0" w:color="BEBEBE"/>
+              <w:top w:val="single" w:sz="6" w:space="0" w:color="BEBEBE"/>
+              <w:left w:val="none" w:sz="0" w:space="0" w:color="000000"/>
+              <w:right w:val="none" w:sz="0" w:space="0" w:color="000000"/>
+            </w:tcBorders>
+            <w:shd w:val="clear" w:color="auto" w:fill="FFFFFF"/>
+            <w:tcMar>
+              <w:top w:w="0" w:type="dxa"/>
+              <w:bottom w:w="0" w:type="dxa"/>
+              <w:left w:w="0" w:type="dxa"/>
+              <w:right w:w="0" w:type="dxa"/>
+            </w:tcMar>
+            <w:vAlign w:val="center"/>
+          </w:tcPr>
+          <w:p>
+            <w:pPr>
+              <w:jc w:val="right"/>
+              <w:pBdr>
+                <w:bottom w:val="none" w:sz="0" w:space="0" w:color="000000"/>
+                <w:top w:val="none" w:sz="0" w:space="0" w:color="000000"/>
+                <w:left w:val="none" w:sz="0" w:space="0" w:color="000000"/>
+                <w:right w:val="none" w:sz="0" w:space="0" w:color="000000"/>
+              </w:pBdr>
+              <w:spacing w:after="100" w:before="100" w:line="240"/>
+              <w:ind w:left="100" w:right="100" w:firstLine="0" w:firstLineChars="0"/>
+              <w:rPr>
+                <w:rFonts w:ascii="Arial" w:hAnsi="Helvetica" w:eastAsia="Helvetica" w:cs="Helvetica"/>
+                <w:i w:val="false"/>
+                <w:b w:val="false"/>
+                <w:u w:val="none"/>
+                <w:strike w:val="false"/>
+                <w:sz w:val="20"/>
+                <w:szCs w:val="20"/>
+                <w:color w:val="000000"/>
+              </w:rPr>
+            </w:pPr>
+            <w:r>
+              <w:rPr>
+                <w:rFonts w:ascii="Arial" w:hAnsi="Helvetica" w:eastAsia="Helvetica" w:cs="Helvetica"/>
+                <w:i w:val="false"/>
+                <w:b w:val="false"/>
+                <w:u w:val="none"/>
+                <w:strike w:val="false"/>
+                <w:sz w:val="20"/>
+                <w:szCs w:val="20"/>
+                <w:color w:val="000000"/>
+              </w:rPr>
               <w:t xml:space="preserve">6</w:t>
             </w:r>
           </w:p>
@@ -15415,6 +16658,60 @@
                 <w:szCs w:val="20"/>
                 <w:color w:val="000000"/>
               </w:rPr>
+              <w:t xml:space="preserve">64</w:t>
+            </w:r>
+          </w:p>
+        </w:tc>
+        <w:tc>
+          <w:tcPr>
+            <w:tcBorders>
+              <w:bottom w:val="single" w:sz="6" w:space="0" w:color="BEBEBE"/>
+              <w:top w:val="single" w:sz="6" w:space="0" w:color="BEBEBE"/>
+              <w:left w:val="none" w:sz="0" w:space="0" w:color="000000"/>
+              <w:right w:val="none" w:sz="0" w:space="0" w:color="000000"/>
+            </w:tcBorders>
+            <w:shd w:val="clear" w:color="auto" w:fill="FFFFFF"/>
+            <w:tcMar>
+              <w:top w:w="0" w:type="dxa"/>
+              <w:bottom w:w="0" w:type="dxa"/>
+              <w:left w:w="0" w:type="dxa"/>
+              <w:right w:w="0" w:type="dxa"/>
+            </w:tcMar>
+            <w:vAlign w:val="center"/>
+          </w:tcPr>
+          <w:p>
+            <w:pPr>
+              <w:jc w:val="right"/>
+              <w:pBdr>
+                <w:bottom w:val="none" w:sz="0" w:space="0" w:color="000000"/>
+                <w:top w:val="none" w:sz="0" w:space="0" w:color="000000"/>
+                <w:left w:val="none" w:sz="0" w:space="0" w:color="000000"/>
+                <w:right w:val="none" w:sz="0" w:space="0" w:color="000000"/>
+              </w:pBdr>
+              <w:spacing w:after="100" w:before="100" w:line="240"/>
+              <w:ind w:left="100" w:right="100" w:firstLine="0" w:firstLineChars="0"/>
+              <w:rPr>
+                <w:rFonts w:ascii="Arial" w:hAnsi="Helvetica" w:eastAsia="Helvetica" w:cs="Helvetica"/>
+                <w:i w:val="false"/>
+                <w:b w:val="false"/>
+                <w:u w:val="none"/>
+                <w:strike w:val="false"/>
+                <w:sz w:val="20"/>
+                <w:szCs w:val="20"/>
+                <w:color w:val="000000"/>
+              </w:rPr>
+            </w:pPr>
+            <w:r>
+              <w:rPr>
+                <w:rFonts w:ascii="Arial" w:hAnsi="Helvetica" w:eastAsia="Helvetica" w:cs="Helvetica"/>
+                <w:i w:val="false"/>
+                <w:b w:val="false"/>
+                <w:u w:val="none"/>
+                <w:strike w:val="false"/>
+                <w:sz w:val="20"/>
+                <w:szCs w:val="20"/>
+                <w:color w:val="000000"/>
+              </w:rPr>
               <w:t xml:space="preserve">28</w:t>
             </w:r>
           </w:p>
@@ -16117,6 +17414,60 @@
                 <w:szCs w:val="20"/>
                 <w:color w:val="000000"/>
               </w:rPr>
+              <w:t xml:space="preserve">59</w:t>
+            </w:r>
+          </w:p>
+        </w:tc>
+        <w:tc>
+          <w:tcPr>
+            <w:tcBorders>
+              <w:bottom w:val="single" w:sz="6" w:space="0" w:color="BEBEBE"/>
+              <w:top w:val="single" w:sz="6" w:space="0" w:color="BEBEBE"/>
+              <w:left w:val="none" w:sz="0" w:space="0" w:color="000000"/>
+              <w:right w:val="none" w:sz="0" w:space="0" w:color="000000"/>
+            </w:tcBorders>
+            <w:shd w:val="clear" w:color="auto" w:fill="FFFFFF"/>
+            <w:tcMar>
+              <w:top w:w="0" w:type="dxa"/>
+              <w:bottom w:w="0" w:type="dxa"/>
+              <w:left w:w="0" w:type="dxa"/>
+              <w:right w:w="0" w:type="dxa"/>
+            </w:tcMar>
+            <w:vAlign w:val="center"/>
+          </w:tcPr>
+          <w:p>
+            <w:pPr>
+              <w:jc w:val="right"/>
+              <w:pBdr>
+                <w:bottom w:val="none" w:sz="0" w:space="0" w:color="000000"/>
+                <w:top w:val="none" w:sz="0" w:space="0" w:color="000000"/>
+                <w:left w:val="none" w:sz="0" w:space="0" w:color="000000"/>
+                <w:right w:val="none" w:sz="0" w:space="0" w:color="000000"/>
+              </w:pBdr>
+              <w:spacing w:after="100" w:before="100" w:line="240"/>
+              <w:ind w:left="100" w:right="100" w:firstLine="0" w:firstLineChars="0"/>
+              <w:rPr>
+                <w:rFonts w:ascii="Arial" w:hAnsi="Helvetica" w:eastAsia="Helvetica" w:cs="Helvetica"/>
+                <w:i w:val="false"/>
+                <w:b w:val="false"/>
+                <w:u w:val="none"/>
+                <w:strike w:val="false"/>
+                <w:sz w:val="20"/>
+                <w:szCs w:val="20"/>
+                <w:color w:val="000000"/>
+              </w:rPr>
+            </w:pPr>
+            <w:r>
+              <w:rPr>
+                <w:rFonts w:ascii="Arial" w:hAnsi="Helvetica" w:eastAsia="Helvetica" w:cs="Helvetica"/>
+                <w:i w:val="false"/>
+                <w:b w:val="false"/>
+                <w:u w:val="none"/>
+                <w:strike w:val="false"/>
+                <w:sz w:val="20"/>
+                <w:szCs w:val="20"/>
+                <w:color w:val="000000"/>
+              </w:rPr>
               <w:t xml:space="preserve">26</w:t>
             </w:r>
           </w:p>
@@ -16741,6 +18092,60 @@
                 <w:szCs w:val="20"/>
                 <w:color w:val="000000"/>
               </w:rPr>
+              <w:t xml:space="preserve">9</w:t>
+            </w:r>
+          </w:p>
+        </w:tc>
+        <w:tc>
+          <w:tcPr>
+            <w:tcBorders>
+              <w:bottom w:val="single" w:sz="6" w:space="0" w:color="BEBEBE"/>
+              <w:top w:val="single" w:sz="6" w:space="0" w:color="BEBEBE"/>
+              <w:left w:val="none" w:sz="0" w:space="0" w:color="000000"/>
+              <w:right w:val="none" w:sz="0" w:space="0" w:color="000000"/>
+            </w:tcBorders>
+            <w:shd w:val="clear" w:color="auto" w:fill="FFFFFF"/>
+            <w:tcMar>
+              <w:top w:w="0" w:type="dxa"/>
+              <w:bottom w:w="0" w:type="dxa"/>
+              <w:left w:w="0" w:type="dxa"/>
+              <w:right w:w="0" w:type="dxa"/>
+            </w:tcMar>
+            <w:vAlign w:val="center"/>
+          </w:tcPr>
+          <w:p>
+            <w:pPr>
+              <w:jc w:val="right"/>
+              <w:pBdr>
+                <w:bottom w:val="none" w:sz="0" w:space="0" w:color="000000"/>
+                <w:top w:val="none" w:sz="0" w:space="0" w:color="000000"/>
+                <w:left w:val="none" w:sz="0" w:space="0" w:color="000000"/>
+                <w:right w:val="none" w:sz="0" w:space="0" w:color="000000"/>
+              </w:pBdr>
+              <w:spacing w:after="100" w:before="100" w:line="240"/>
+              <w:ind w:left="100" w:right="100" w:firstLine="0" w:firstLineChars="0"/>
+              <w:rPr>
+                <w:rFonts w:ascii="Arial" w:hAnsi="Helvetica" w:eastAsia="Helvetica" w:cs="Helvetica"/>
+                <w:i w:val="false"/>
+                <w:b w:val="false"/>
+                <w:u w:val="none"/>
+                <w:strike w:val="false"/>
+                <w:sz w:val="20"/>
+                <w:szCs w:val="20"/>
+                <w:color w:val="000000"/>
+              </w:rPr>
+            </w:pPr>
+            <w:r>
+              <w:rPr>
+                <w:rFonts w:ascii="Arial" w:hAnsi="Helvetica" w:eastAsia="Helvetica" w:cs="Helvetica"/>
+                <w:i w:val="false"/>
+                <w:b w:val="false"/>
+                <w:u w:val="none"/>
+                <w:strike w:val="false"/>
+                <w:sz w:val="20"/>
+                <w:szCs w:val="20"/>
+                <w:color w:val="000000"/>
+              </w:rPr>
               <w:t xml:space="preserve">10</w:t>
             </w:r>
           </w:p>
@@ -17419,6 +18824,60 @@
                 <w:szCs w:val="20"/>
                 <w:color w:val="000000"/>
               </w:rPr>
+              <w:t xml:space="preserve">5</w:t>
+            </w:r>
+          </w:p>
+        </w:tc>
+        <w:tc>
+          <w:tcPr>
+            <w:tcBorders>
+              <w:bottom w:val="single" w:sz="6" w:space="0" w:color="BEBEBE"/>
+              <w:top w:val="single" w:sz="6" w:space="0" w:color="BEBEBE"/>
+              <w:left w:val="none" w:sz="0" w:space="0" w:color="000000"/>
+              <w:right w:val="none" w:sz="0" w:space="0" w:color="000000"/>
+            </w:tcBorders>
+            <w:shd w:val="clear" w:color="auto" w:fill="FFFFFF"/>
+            <w:tcMar>
+              <w:top w:w="0" w:type="dxa"/>
+              <w:bottom w:w="0" w:type="dxa"/>
+              <w:left w:w="0" w:type="dxa"/>
+              <w:right w:w="0" w:type="dxa"/>
+            </w:tcMar>
+            <w:vAlign w:val="center"/>
+          </w:tcPr>
+          <w:p>
+            <w:pPr>
+              <w:jc w:val="right"/>
+              <w:pBdr>
+                <w:bottom w:val="none" w:sz="0" w:space="0" w:color="000000"/>
+                <w:top w:val="none" w:sz="0" w:space="0" w:color="000000"/>
+                <w:left w:val="none" w:sz="0" w:space="0" w:color="000000"/>
+                <w:right w:val="none" w:sz="0" w:space="0" w:color="000000"/>
+              </w:pBdr>
+              <w:spacing w:after="100" w:before="100" w:line="240"/>
+              <w:ind w:left="100" w:right="100" w:firstLine="0" w:firstLineChars="0"/>
+              <w:rPr>
+                <w:rFonts w:ascii="Arial" w:hAnsi="Helvetica" w:eastAsia="Helvetica" w:cs="Helvetica"/>
+                <w:i w:val="false"/>
+                <w:b w:val="false"/>
+                <w:u w:val="none"/>
+                <w:strike w:val="false"/>
+                <w:sz w:val="20"/>
+                <w:szCs w:val="20"/>
+                <w:color w:val="000000"/>
+              </w:rPr>
+            </w:pPr>
+            <w:r>
+              <w:rPr>
+                <w:rFonts w:ascii="Arial" w:hAnsi="Helvetica" w:eastAsia="Helvetica" w:cs="Helvetica"/>
+                <w:i w:val="false"/>
+                <w:b w:val="false"/>
+                <w:u w:val="none"/>
+                <w:strike w:val="false"/>
+                <w:sz w:val="20"/>
+                <w:szCs w:val="20"/>
+                <w:color w:val="000000"/>
+              </w:rPr>
               <w:t xml:space="preserve">144</w:t>
             </w:r>
           </w:p>
@@ -17989,6 +19448,60 @@
                 <w:szCs w:val="20"/>
                 <w:color w:val="000000"/>
               </w:rPr>
+              <w:t xml:space="preserve">4</w:t>
+            </w:r>
+          </w:p>
+        </w:tc>
+        <w:tc>
+          <w:tcPr>
+            <w:tcBorders>
+              <w:bottom w:val="single" w:sz="6" w:space="0" w:color="BEBEBE"/>
+              <w:top w:val="single" w:sz="6" w:space="0" w:color="BEBEBE"/>
+              <w:left w:val="none" w:sz="0" w:space="0" w:color="000000"/>
+              <w:right w:val="none" w:sz="0" w:space="0" w:color="000000"/>
+            </w:tcBorders>
+            <w:shd w:val="clear" w:color="auto" w:fill="FFFFFF"/>
+            <w:tcMar>
+              <w:top w:w="0" w:type="dxa"/>
+              <w:bottom w:w="0" w:type="dxa"/>
+              <w:left w:w="0" w:type="dxa"/>
+              <w:right w:w="0" w:type="dxa"/>
+            </w:tcMar>
+            <w:vAlign w:val="center"/>
+          </w:tcPr>
+          <w:p>
+            <w:pPr>
+              <w:jc w:val="right"/>
+              <w:pBdr>
+                <w:bottom w:val="none" w:sz="0" w:space="0" w:color="000000"/>
+                <w:top w:val="none" w:sz="0" w:space="0" w:color="000000"/>
+                <w:left w:val="none" w:sz="0" w:space="0" w:color="000000"/>
+                <w:right w:val="none" w:sz="0" w:space="0" w:color="000000"/>
+              </w:pBdr>
+              <w:spacing w:after="100" w:before="100" w:line="240"/>
+              <w:ind w:left="100" w:right="100" w:firstLine="0" w:firstLineChars="0"/>
+              <w:rPr>
+                <w:rFonts w:ascii="Arial" w:hAnsi="Helvetica" w:eastAsia="Helvetica" w:cs="Helvetica"/>
+                <w:i w:val="false"/>
+                <w:b w:val="false"/>
+                <w:u w:val="none"/>
+                <w:strike w:val="false"/>
+                <w:sz w:val="20"/>
+                <w:szCs w:val="20"/>
+                <w:color w:val="000000"/>
+              </w:rPr>
+            </w:pPr>
+            <w:r>
+              <w:rPr>
+                <w:rFonts w:ascii="Arial" w:hAnsi="Helvetica" w:eastAsia="Helvetica" w:cs="Helvetica"/>
+                <w:i w:val="false"/>
+                <w:b w:val="false"/>
+                <w:u w:val="none"/>
+                <w:strike w:val="false"/>
+                <w:sz w:val="20"/>
+                <w:szCs w:val="20"/>
+                <w:color w:val="000000"/>
+              </w:rPr>
               <w:t xml:space="preserve">8</w:t>
             </w:r>
           </w:p>
@@ -18560,6 +20073,60 @@
                 <w:color w:val="000000"/>
               </w:rPr>
               <w:t xml:space="preserve">68</w:t>
+            </w:r>
+          </w:p>
+        </w:tc>
+        <w:tc>
+          <w:tcPr>
+            <w:tcBorders>
+              <w:bottom w:val="single" w:sz="12" w:space="0" w:color="BEBEBE"/>
+              <w:top w:val="single" w:sz="6" w:space="0" w:color="BEBEBE"/>
+              <w:left w:val="none" w:sz="0" w:space="0" w:color="000000"/>
+              <w:right w:val="none" w:sz="0" w:space="0" w:color="000000"/>
+            </w:tcBorders>
+            <w:shd w:val="clear" w:color="auto" w:fill="FFFFFF"/>
+            <w:tcMar>
+              <w:top w:w="0" w:type="dxa"/>
+              <w:bottom w:w="0" w:type="dxa"/>
+              <w:left w:w="0" w:type="dxa"/>
+              <w:right w:w="0" w:type="dxa"/>
+            </w:tcMar>
+            <w:vAlign w:val="center"/>
+          </w:tcPr>
+          <w:p>
+            <w:pPr>
+              <w:jc w:val="right"/>
+              <w:pBdr>
+                <w:bottom w:val="none" w:sz="0" w:space="0" w:color="000000"/>
+                <w:top w:val="none" w:sz="0" w:space="0" w:color="000000"/>
+                <w:left w:val="none" w:sz="0" w:space="0" w:color="000000"/>
+                <w:right w:val="none" w:sz="0" w:space="0" w:color="000000"/>
+              </w:pBdr>
+              <w:spacing w:after="100" w:before="100" w:line="240"/>
+              <w:ind w:left="100" w:right="100" w:firstLine="0" w:firstLineChars="0"/>
+              <w:rPr>
+                <w:rFonts w:ascii="Arial" w:hAnsi="Helvetica" w:eastAsia="Helvetica" w:cs="Helvetica"/>
+                <w:i w:val="false"/>
+                <w:b w:val="false"/>
+                <w:u w:val="none"/>
+                <w:strike w:val="false"/>
+                <w:sz w:val="20"/>
+                <w:szCs w:val="20"/>
+                <w:color w:val="000000"/>
+              </w:rPr>
+            </w:pPr>
+            <w:r>
+              <w:rPr>
+                <w:rFonts w:ascii="Arial" w:hAnsi="Helvetica" w:eastAsia="Helvetica" w:cs="Helvetica"/>
+                <w:i w:val="false"/>
+                <w:b w:val="false"/>
+                <w:u w:val="none"/>
+                <w:strike w:val="false"/>
+                <w:sz w:val="20"/>
+                <w:szCs w:val="20"/>
+                <w:color w:val="000000"/>
+              </w:rPr>
+              <w:t xml:space="preserve">15</w:t>
             </w:r>
           </w:p>
         </w:tc>

</xml_diff>